<commit_message>
Nova identidade visual Zog; remove leitura por foto e chave da API
Co-Authored-By: Claude Opus 5.5 <noreply@anthropic.com>
Claude-Session: https://claude.ai/code/session_01CmJKCGkAME5p6TrLgU2EiD
</commit_message>
<xml_diff>
--- a/modelo-hemograma.docx
+++ b/modelo-hemograma.docx
@@ -12,12 +12,12 @@
           <wp:anchor distT="0" distB="0" distL="114300" distR="114300" simplePos="0" relativeHeight="251658240" behindDoc="0" locked="0" layoutInCell="1" hidden="0" allowOverlap="1" wp14:anchorId="1B77E624" wp14:editId="61C4BA55">
             <wp:simplePos x="0" y="0"/>
             <wp:positionH relativeFrom="column">
-              <wp:posOffset>2336165</wp:posOffset>
+              <wp:posOffset>2091372</wp:posOffset>
             </wp:positionH>
             <wp:positionV relativeFrom="paragraph">
               <wp:posOffset>-71754</wp:posOffset>
             </wp:positionV>
-            <wp:extent cx="1704975" cy="1447800"/>
+            <wp:extent cx="2194560" cy="1152463"/>
             <wp:effectExtent l="0" t="0" r="0" b="0"/>
             <wp:wrapSquare wrapText="bothSides" distT="0" distB="0" distL="114300" distR="114300"/>
             <wp:docPr id="3" name="image2.jpg" descr="C:\Users\Maisa\Desktop\unnamed.jpg"/>
@@ -31,7 +31,7 @@
                   </pic:nvPicPr>
                   <pic:blipFill>
                     <a:blip r:embed="rId5"/>
-                    <a:srcRect b="15804"/>
+                    <a:srcRect/>
                     <a:stretch>
                       <a:fillRect/>
                     </a:stretch>
@@ -39,7 +39,7 @@
                   <pic:spPr>
                     <a:xfrm>
                       <a:off x="0" y="0"/>
-                      <a:ext cx="1704975" cy="1447800"/>
+                      <a:ext cx="2194560" cy="1152463"/>
                     </a:xfrm>
                     <a:prstGeom prst="rect">
                       <a:avLst/>

</xml_diff>